<commit_message>
Update deployment guide and demo presentation
- Add PSSO setup section to deployment guide (new joiner onboarding,
  auth methods, device lifecycle, manual push, verification steps)
- Add tested on section (macOS 15.1, Tahoe 26.2, Entra ID, Browser SSO)
- Add 3 new slides to demo PPT (PSSO onboarding, device lifecycle,
  tested on/compatibility)

Co-Authored-By: Claude Sonnet 4.6 <noreply@anthropic.com>
</commit_message>
<xml_diff>
--- a/MDM_SaaS_Local_Deployment_Guide.docx
+++ b/MDM_SaaS_Local_Deployment_Guide.docx
@@ -6175,6 +6175,540 @@
       </w:tr>
     </w:tbl>
     <w:p/>
+    <w:p>
+      <w:pPr>
+        <w:keepNext/>
+        <w:spacing w:before="360" w:after="120"/>
+        <w:pBdr>
+          <w:bottom w:val="single" w:sz="6" w:color="1D4ED8"/>
+        </w:pBdr>
+      </w:pPr>
+      <w:r>
+        <w:rPr>
+          <w:b/>
+          <w:color w:val="1D4ED8"/>
+          <w:sz w:val="40"/>
+        </w:rPr>
+        <w:t xml:space="preserve">15.  Platform SSO (PSSO) Setup</w:t>
+      </w:r>
+    </w:p>
+    <w:p>
+      <w:pPr>
+        <w:spacing w:before="60" w:after="60"/>
+      </w:pPr>
+      <w:r>
+        <w:rPr>
+          <w:color w:val="0F172A"/>
+          <w:sz w:val="22"/>
+        </w:rPr>
+        <w:t xml:space="preserve">Platform SSO enables macOS login with Microsoft Entra ID credentials. PSSO is automatically pushed to devices when they enroll — no manual action required.</w:t>
+      </w:r>
+    </w:p>
+    <w:p>
+      <w:pPr>
+        <w:spacing w:before="0" w:after="0"/>
+      </w:pPr>
+    </w:p>
+    <w:p>
+      <w:pPr>
+        <w:keepNext/>
+        <w:spacing w:before="280" w:after="80"/>
+      </w:pPr>
+      <w:r>
+        <w:rPr>
+          <w:b/>
+          <w:color w:val="0F172A"/>
+          <w:sz w:val="28"/>
+        </w:rPr>
+        <w:t xml:space="preserve">15.1  Prerequisites</w:t>
+      </w:r>
+    </w:p>
+    <w:p>
+      <w:pPr>
+        <w:pStyle w:val="ListBullet"/>
+        <w:spacing w:before="20" w:after="40"/>
+        <w:ind w:left="360"/>
+      </w:pPr>
+      <w:r>
+        <w:rPr>
+          <w:color w:val="0F172A"/>
+          <w:sz w:val="22"/>
+        </w:rPr>
+        <w:t xml:space="preserve">Microsoft Company Portal installed on the Mac (free from Mac App Store — no Intune license required)</w:t>
+      </w:r>
+    </w:p>
+    <w:p>
+      <w:pPr>
+        <w:pStyle w:val="ListBullet"/>
+        <w:spacing w:before="20" w:after="40"/>
+        <w:ind w:left="360"/>
+      </w:pPr>
+      <w:r>
+        <w:rPr>
+          <w:color w:val="0F172A"/>
+          <w:sz w:val="22"/>
+        </w:rPr>
+        <w:t xml:space="preserve">Device enrolled in MDM</w:t>
+      </w:r>
+    </w:p>
+    <w:p>
+      <w:pPr>
+        <w:pStyle w:val="ListBullet"/>
+        <w:spacing w:before="20" w:after="40"/>
+        <w:ind w:left="360"/>
+      </w:pPr>
+      <w:r>
+        <w:rPr>
+          <w:color w:val="0F172A"/>
+          <w:sz w:val="22"/>
+        </w:rPr>
+        <w:t xml:space="preserve">Entra ID account for the user</w:t>
+      </w:r>
+    </w:p>
+    <w:p>
+      <w:pPr>
+        <w:spacing w:before="0" w:after="0"/>
+      </w:pPr>
+    </w:p>
+    <w:p>
+      <w:pPr>
+        <w:keepNext/>
+        <w:spacing w:before="280" w:after="80"/>
+      </w:pPr>
+      <w:r>
+        <w:rPr>
+          <w:b/>
+          <w:color w:val="0F172A"/>
+          <w:sz w:val="28"/>
+        </w:rPr>
+        <w:t xml:space="preserve">15.2  New Joiner Onboarding Flow</w:t>
+      </w:r>
+    </w:p>
+    <w:p>
+      <w:pPr>
+        <w:pStyle w:val="ListNumber"/>
+        <w:spacing w:before="20" w:after="40"/>
+        <w:ind w:left="360"/>
+      </w:pPr>
+      <w:r>
+        <w:rPr>
+          <w:color w:val="0F172A"/>
+          <w:sz w:val="22"/>
+        </w:rPr>
+        <w:t xml:space="preserve">Admin generates enrollment token from Dashboard → Enrollment</w:t>
+      </w:r>
+    </w:p>
+    <w:p>
+      <w:pPr>
+        <w:pStyle w:val="ListNumber"/>
+        <w:spacing w:before="20" w:after="40"/>
+        <w:ind w:left="360"/>
+      </w:pPr>
+      <w:r>
+        <w:rPr>
+          <w:color w:val="0F172A"/>
+          <w:sz w:val="22"/>
+        </w:rPr>
+        <w:t xml:space="preserve">Share the enrollment URL with the new joiner</w:t>
+      </w:r>
+    </w:p>
+    <w:p>
+      <w:pPr>
+        <w:pStyle w:val="ListNumber"/>
+        <w:spacing w:before="20" w:after="40"/>
+        <w:ind w:left="360"/>
+      </w:pPr>
+      <w:r>
+        <w:rPr>
+          <w:color w:val="0F172A"/>
+          <w:sz w:val="22"/>
+        </w:rPr>
+        <w:t xml:space="preserve">New joiner opens URL in Safari → installs enrollment profile</w:t>
+      </w:r>
+    </w:p>
+    <w:p>
+      <w:pPr>
+        <w:pStyle w:val="ListNumber"/>
+        <w:spacing w:before="20" w:after="40"/>
+        <w:ind w:left="360"/>
+      </w:pPr>
+      <w:r>
+        <w:rPr>
+          <w:color w:val="0F172A"/>
+          <w:sz w:val="22"/>
+        </w:rPr>
+        <w:t xml:space="preserve">PSSO profile is automatically pushed within seconds of enrollment</w:t>
+      </w:r>
+    </w:p>
+    <w:p>
+      <w:pPr>
+        <w:pStyle w:val="ListNumber"/>
+        <w:spacing w:before="20" w:after="40"/>
+        <w:ind w:left="360"/>
+      </w:pPr>
+      <w:r>
+        <w:rPr>
+          <w:color w:val="0F172A"/>
+          <w:sz w:val="22"/>
+        </w:rPr>
+        <w:t xml:space="preserve">New joiner installs Microsoft Company Portal from Mac App Store</w:t>
+      </w:r>
+    </w:p>
+    <w:p>
+      <w:pPr>
+        <w:pStyle w:val="ListNumber"/>
+        <w:spacing w:before="20" w:after="40"/>
+        <w:ind w:left="360"/>
+      </w:pPr>
+      <w:r>
+        <w:rPr>
+          <w:color w:val="0F172A"/>
+          <w:sz w:val="22"/>
+        </w:rPr>
+        <w:t xml:space="preserve">Company Portal shows a registration prompt → sign in with Entra ID credentials</w:t>
+      </w:r>
+    </w:p>
+    <w:p>
+      <w:pPr>
+        <w:pStyle w:val="ListNumber"/>
+        <w:spacing w:before="20" w:after="40"/>
+        <w:ind w:left="360"/>
+      </w:pPr>
+      <w:r>
+        <w:rPr>
+          <w:color w:val="0F172A"/>
+          <w:sz w:val="22"/>
+        </w:rPr>
+        <w:t xml:space="preserve">Lock screen (Cmd+Ctrl+Q) → login window now supports Entra ID authentication</w:t>
+      </w:r>
+    </w:p>
+    <w:p>
+      <w:pPr>
+        <w:pStyle w:val="ListNumber"/>
+        <w:spacing w:before="20" w:after="40"/>
+        <w:ind w:left="360"/>
+      </w:pPr>
+      <w:r>
+        <w:rPr>
+          <w:color w:val="0F172A"/>
+          <w:sz w:val="22"/>
+        </w:rPr>
+        <w:t xml:space="preserve">On first login with Entra credentials, a new macOS account is created automatically</w:t>
+      </w:r>
+    </w:p>
+    <w:p>
+      <w:pPr>
+        <w:spacing w:before="0" w:after="0"/>
+      </w:pPr>
+    </w:p>
+    <w:p>
+      <w:pPr>
+        <w:keepNext/>
+        <w:spacing w:before="280" w:after="80"/>
+      </w:pPr>
+      <w:r>
+        <w:rPr>
+          <w:b/>
+          <w:color w:val="0F172A"/>
+          <w:sz w:val="28"/>
+        </w:rPr>
+        <w:t xml:space="preserve">15.3  Auth Methods</w:t>
+      </w:r>
+    </w:p>
+    <w:p>
+      <w:pPr>
+        <w:pStyle w:val="ListBullet"/>
+        <w:spacing w:before="20" w:after="40"/>
+        <w:ind w:left="360"/>
+      </w:pPr>
+      <w:r>
+        <w:rPr>
+          <w:color w:val="0F172A"/>
+          <w:sz w:val="22"/>
+        </w:rPr>
+        <w:t xml:space="preserve">Secure Enclave Key (recommended for physical Macs with T2/M1/M2/M3 chip) — hardware-bound key, most secure</w:t>
+      </w:r>
+    </w:p>
+    <w:p>
+      <w:pPr>
+        <w:pStyle w:val="ListBullet"/>
+        <w:spacing w:before="20" w:after="40"/>
+        <w:ind w:left="360"/>
+      </w:pPr>
+      <w:r>
+        <w:rPr>
+          <w:color w:val="0F172A"/>
+          <w:sz w:val="22"/>
+        </w:rPr>
+        <w:t xml:space="preserve">Password — Entra password synced to local account, works on VMs</w:t>
+      </w:r>
+    </w:p>
+    <w:p>
+      <w:pPr>
+        <w:spacing w:before="0" w:after="0"/>
+      </w:pPr>
+    </w:p>
+    <w:p>
+      <w:pPr>
+        <w:keepNext/>
+        <w:spacing w:before="280" w:after="80"/>
+      </w:pPr>
+      <w:r>
+        <w:rPr>
+          <w:b/>
+          <w:color w:val="0F172A"/>
+          <w:sz w:val="28"/>
+        </w:rPr>
+        <w:t xml:space="preserve">15.4  Device Lifecycle</w:t>
+      </w:r>
+    </w:p>
+    <w:p>
+      <w:pPr>
+        <w:pStyle w:val="ListBullet"/>
+        <w:spacing w:before="20" w:after="40"/>
+        <w:ind w:left="360"/>
+      </w:pPr>
+      <w:r>
+        <w:rPr>
+          <w:color w:val="0F172A"/>
+          <w:sz w:val="22"/>
+        </w:rPr>
+        <w:t xml:space="preserve">Device erased → status set to wiped immediately in dashboard</w:t>
+      </w:r>
+    </w:p>
+    <w:p>
+      <w:pPr>
+        <w:pStyle w:val="ListBullet"/>
+        <w:spacing w:before="20" w:after="40"/>
+        <w:ind w:left="360"/>
+      </w:pPr>
+      <w:r>
+        <w:rPr>
+          <w:color w:val="0F172A"/>
+          <w:sz w:val="22"/>
+        </w:rPr>
+        <w:t xml:space="preserve">After wipe completes → device transitions to spare (available for redeployment)</w:t>
+      </w:r>
+    </w:p>
+    <w:p>
+      <w:pPr>
+        <w:pStyle w:val="ListBullet"/>
+        <w:spacing w:before="20" w:after="40"/>
+        <w:ind w:left="360"/>
+      </w:pPr>
+      <w:r>
+        <w:rPr>
+          <w:color w:val="0F172A"/>
+          <w:sz w:val="22"/>
+        </w:rPr>
+        <w:t xml:space="preserve">Reassign spare device to new joiner → re-enroll → PSSO auto-pushed again</w:t>
+      </w:r>
+    </w:p>
+    <w:p>
+      <w:pPr>
+        <w:spacing w:before="0" w:after="0"/>
+      </w:pPr>
+    </w:p>
+    <w:p>
+      <w:pPr>
+        <w:keepNext/>
+        <w:spacing w:before="280" w:after="80"/>
+      </w:pPr>
+      <w:r>
+        <w:rPr>
+          <w:b/>
+          <w:color w:val="0F172A"/>
+          <w:sz w:val="28"/>
+        </w:rPr>
+        <w:t xml:space="preserve">15.5  Manual PSSO Push (if needed)</w:t>
+      </w:r>
+    </w:p>
+    <w:p>
+      <w:pPr>
+        <w:pStyle w:val="ListBullet"/>
+        <w:spacing w:before="20" w:after="40"/>
+        <w:ind w:left="360"/>
+      </w:pPr>
+      <w:r>
+        <w:rPr>
+          <w:color w:val="0F172A"/>
+          <w:sz w:val="22"/>
+        </w:rPr>
+        <w:t xml:space="preserve">Dashboard → select device → Remote Actions → "Push PSSO" button</w:t>
+      </w:r>
+    </w:p>
+    <w:p>
+      <w:pPr>
+        <w:pStyle w:val="ListBullet"/>
+        <w:spacing w:before="20" w:after="40"/>
+        <w:ind w:left="360"/>
+      </w:pPr>
+      <w:r>
+        <w:rPr>
+          <w:color w:val="0F172A"/>
+          <w:sz w:val="22"/>
+        </w:rPr>
+        <w:t xml:space="preserve">Or Dashboard → Profiles → "Push PSSO Profile" (pushes to all enrolled devices)</w:t>
+      </w:r>
+    </w:p>
+    <w:p>
+      <w:pPr>
+        <w:spacing w:before="0" w:after="0"/>
+      </w:pPr>
+    </w:p>
+    <w:p>
+      <w:pPr>
+        <w:keepNext/>
+        <w:spacing w:before="280" w:after="80"/>
+      </w:pPr>
+      <w:r>
+        <w:rPr>
+          <w:b/>
+          <w:color w:val="0F172A"/>
+          <w:sz w:val="28"/>
+        </w:rPr>
+        <w:t xml:space="preserve">15.6  Verify PSSO Registration (on Mac Terminal)</w:t>
+      </w:r>
+    </w:p>
+    <w:p>
+      <w:pPr>
+        <w:spacing w:before="60" w:after="60"/>
+      </w:pPr>
+      <w:r>
+        <w:rPr>
+          <w:color w:val="0F172A"/>
+          <w:sz w:val="22"/>
+        </w:rPr>
+        <w:t xml:space="preserve">Run the following command in Terminal:</w:t>
+      </w:r>
+    </w:p>
+    <w:tbl>
+      <w:tblPr>
+        <w:tblStyle w:val="TableGrid"/>
+        <w:tblW w:type="auto" w:w="0"/>
+        <w:jc w:val="left"/>
+        <w:tblLook w:val="04A0" w:firstColumn="1" w:firstRow="1" w:lastColumn="0" w:lastRow="0" w:noHBand="0" w:noVBand="1"/>
+      </w:tblPr>
+      <w:tblGrid>
+        <w:gridCol w:w="9360"/>
+      </w:tblGrid>
+      <w:tr>
+        <w:tc>
+          <w:tcPr>
+            <w:tcW w:type="dxa" w:w="9360"/>
+            <w:shd w:val="clear" w:color="auto" w:fill="F1F5F9"/>
+          </w:tcPr>
+          <w:p>
+            <w:pPr>
+              <w:spacing w:before="20" w:after="20"/>
+            </w:pPr>
+            <w:r>
+              <w:rPr>
+                <w:rFonts w:ascii="Courier New" w:hAnsi="Courier New"/>
+                <w:color w:val="0F172A"/>
+                <w:sz w:val="19"/>
+              </w:rPr>
+              <w:t xml:space="preserve">app-sso platform -s</w:t>
+            </w:r>
+          </w:p>
+        </w:tc>
+      </w:tr>
+    </w:tbl>
+    <w:p>
+      <w:pPr>
+        <w:spacing w:before="60" w:after="60"/>
+      </w:pPr>
+      <w:r>
+        <w:rPr>
+          <w:color w:val="0F172A"/>
+          <w:sz w:val="22"/>
+        </w:rPr>
+        <w:t xml:space="preserve">Look for: "registrationCompleted": true and "authorizationEnabled": true</w:t>
+      </w:r>
+    </w:p>
+    <w:p>
+      <w:pPr>
+        <w:spacing w:before="0" w:after="0"/>
+      </w:pPr>
+    </w:p>
+    <w:p>
+      <w:pPr>
+        <w:keepNext/>
+        <w:spacing w:before="360" w:after="120"/>
+        <w:pBdr>
+          <w:bottom w:val="single" w:sz="6" w:color="1D4ED8"/>
+        </w:pBdr>
+      </w:pPr>
+      <w:r>
+        <w:rPr>
+          <w:b/>
+          <w:color w:val="1D4ED8"/>
+          <w:sz w:val="40"/>
+        </w:rPr>
+        <w:t xml:space="preserve">16.  Tested On</w:t>
+      </w:r>
+    </w:p>
+    <w:p>
+      <w:pPr>
+        <w:pStyle w:val="ListBullet"/>
+        <w:spacing w:before="20" w:after="40"/>
+        <w:ind w:left="360"/>
+      </w:pPr>
+      <w:r>
+        <w:rPr>
+          <w:color w:val="0F172A"/>
+          <w:sz w:val="22"/>
+        </w:rPr>
+        <w:t xml:space="preserve">macOS Sequoia 15.1 (UTM VM) — Password PSSO auth ✓</w:t>
+      </w:r>
+    </w:p>
+    <w:p>
+      <w:pPr>
+        <w:pStyle w:val="ListBullet"/>
+        <w:spacing w:before="20" w:after="40"/>
+        <w:ind w:left="360"/>
+      </w:pPr>
+      <w:r>
+        <w:rPr>
+          <w:color w:val="0F172A"/>
+          <w:sz w:val="22"/>
+        </w:rPr>
+        <w:t xml:space="preserve">macOS Tahoe 26.2 beta (physical MacBook Pro) — Secure Enclave Key PSSO auth ✓</w:t>
+      </w:r>
+    </w:p>
+    <w:p>
+      <w:pPr>
+        <w:pStyle w:val="ListBullet"/>
+        <w:spacing w:before="20" w:after="40"/>
+        <w:ind w:left="360"/>
+      </w:pPr>
+      <w:r>
+        <w:rPr>
+          <w:color w:val="0F172A"/>
+          <w:sz w:val="22"/>
+        </w:rPr>
+        <w:t xml:space="preserve">Microsoft Entra ID PSSO — no Intune license required ✓</w:t>
+      </w:r>
+    </w:p>
+    <w:p>
+      <w:pPr>
+        <w:pStyle w:val="ListBullet"/>
+        <w:spacing w:before="20" w:after="40"/>
+        <w:ind w:left="360"/>
+      </w:pPr>
+      <w:r>
+        <w:rPr>
+          <w:color w:val="0F172A"/>
+          <w:sz w:val="22"/>
+        </w:rPr>
+        <w:t xml:space="preserve">Browser SSO verified (Safari, Microsoft 365) ✓</w:t>
+      </w:r>
+    </w:p>
+    <w:p>
+      <w:pPr>
+        <w:spacing w:before="0" w:after="0"/>
+      </w:pPr>
+    </w:p>
     <w:p>
       <w:pPr>
         <w:keepNext/>

</xml_diff>